<commit_message>
chore(abdm-ft): HIP_INIT_SHARE_CARECONTEXT passes on re-run; M2 report 13 of 13 PASS
HIP_INIT_SHARE_CARECONTEXT was a conditional pass on 85ae1bd because no
ClinicX screen showed the stored consent. Re-run on 2026-10-29 with the
tester on backend db30fa2 / frontend feb708f, after the Consents view was
added: consent 023332f4 GRANTED, notify 8b0b8f8b, HI request 7a34c022,
transfer 60 DELIVERED, the consent shown under ABDM Records > Consents with
its HI types, date range, purpose and expiry, and the record decrypted in the
PHR app. Workbook rewritten (check exit 0) and report rebuilt: 13 PASS, no
conditional pass. Run log, manifest, meta (builds, finding, re-run note) and
the plan updated; the earlier evidence and final files are kept in archive/.

Co-Authored-By: Claude Opus 5.5 <noreply@anthropic.com>
</commit_message>
<xml_diff>
--- a/abdm-ft/final/report-m2.docx
+++ b/abdm-ft/final/report-m2.docx
@@ -847,7 +847,7 @@
           </w:tcPr>
           <w:p>
             <w:r>
-              <w:t>12</w:t>
+              <w:t>13</w:t>
             </w:r>
           </w:p>
         </w:tc>
@@ -857,7 +857,7 @@
           </w:tcPr>
           <w:p>
             <w:r>
-              <w:t>12</w:t>
+              <w:t>13</w:t>
             </w:r>
           </w:p>
         </w:tc>
@@ -879,7 +879,7 @@
           </w:tcPr>
           <w:p>
             <w:r>
-              <w:t>1</w:t>
+              <w:t>0</w:t>
             </w:r>
           </w:p>
         </w:tc>
@@ -889,7 +889,7 @@
           </w:tcPr>
           <w:p>
             <w:r>
-              <w:t>1</w:t>
+              <w:t>0</w:t>
             </w:r>
           </w:p>
         </w:tc>
@@ -1970,6 +1970,16 @@
           </w:tcPr>
           <w:p>
             <w:r>
+              <w:t>1</w:t>
+            </w:r>
+          </w:p>
+        </w:tc>
+        <w:tc>
+          <w:tcPr>
+            <w:tcW w:type="dxa" w:w="1080"/>
+          </w:tcPr>
+          <w:p>
+            <w:r>
               <w:t>0</w:t>
             </w:r>
           </w:p>
@@ -1980,7 +1990,7 @@
           </w:tcPr>
           <w:p>
             <w:r>
-              <w:t>1</w:t>
+              <w:t>0</w:t>
             </w:r>
           </w:p>
         </w:tc>
@@ -2011,112 +2021,6 @@
           <w:p>
             <w:r>
               <w:t>0</w:t>
-            </w:r>
-          </w:p>
-        </w:tc>
-        <w:tc>
-          <w:tcPr>
-            <w:tcW w:type="dxa" w:w="1080"/>
-          </w:tcPr>
-          <w:p>
-            <w:r>
-              <w:t>0</w:t>
-            </w:r>
-          </w:p>
-        </w:tc>
-      </w:tr>
-    </w:tbl>
-    <w:p>
-      <w:pPr>
-        <w:pStyle w:val="Heading2"/>
-      </w:pPr>
-      <w:r>
-        <w:t>Conditional passes</w:t>
-      </w:r>
-    </w:p>
-    <w:tbl>
-      <w:tblPr>
-        <w:tblStyle w:val="TableGrid"/>
-        <w:tblW w:type="auto" w:w="0"/>
-        <w:tblLook w:firstColumn="1" w:firstRow="1" w:lastColumn="0" w:lastRow="0" w:noHBand="0" w:noVBand="1" w:val="04A0"/>
-      </w:tblPr>
-      <w:tblGrid>
-        <w:gridCol w:w="2880"/>
-        <w:gridCol w:w="2880"/>
-        <w:gridCol w:w="2880"/>
-      </w:tblGrid>
-      <w:tr>
-        <w:trPr>
-          <w:tblHeader w:val="true"/>
-        </w:trPr>
-        <w:tc>
-          <w:tcPr>
-            <w:tcW w:type="dxa" w:w="2880"/>
-          </w:tcPr>
-          <w:p>
-            <w:r>
-              <w:rPr>
-                <w:b/>
-              </w:rPr>
-              <w:t>Test case ID</w:t>
-            </w:r>
-          </w:p>
-        </w:tc>
-        <w:tc>
-          <w:tcPr>
-            <w:tcW w:type="dxa" w:w="2880"/>
-          </w:tcPr>
-          <w:p>
-            <w:r>
-              <w:rPr>
-                <w:b/>
-              </w:rPr>
-              <w:t>Title</w:t>
-            </w:r>
-          </w:p>
-        </w:tc>
-        <w:tc>
-          <w:tcPr>
-            <w:tcW w:type="dxa" w:w="2880"/>
-          </w:tcPr>
-          <w:p>
-            <w:r>
-              <w:rPr>
-                <w:b/>
-              </w:rPr>
-              <w:t>Condition</w:t>
-            </w:r>
-          </w:p>
-        </w:tc>
-      </w:tr>
-      <w:tr>
-        <w:tc>
-          <w:tcPr>
-            <w:tcW w:type="dxa" w:w="2880"/>
-          </w:tcPr>
-          <w:p>
-            <w:r>
-              <w:t>HIP_INIT_SHARE_CARECONTEXT</w:t>
-            </w:r>
-          </w:p>
-        </w:tc>
-        <w:tc>
-          <w:tcPr>
-            <w:tcW w:type="dxa" w:w="2880"/>
-          </w:tcPr>
-          <w:p>
-            <w:r>
-              <w:t>HIP must share health records associated with care context on request</w:t>
-            </w:r>
-          </w:p>
-        </w:tc>
-        <w:tc>
-          <w:tcPr>
-            <w:tcW w:type="dxa" w:w="2880"/>
-          </w:tcPr>
-          <w:p>
-            <w:r>
-              <w:t>Expected Result met: records received in the PHR app, decrypted with the HIP's public key and nonce, in NRCES document types (tester's screenshots phr-1..3; records also delivered by transfers 51 and 53 this run). Pushed care contexts are within the consent's and the request date range equals the consent's. Condition: ClinicX has no screen that shows the stored consent (HI types, date range, purpose, expiry); it is stored whole in AbdmConsents only. Outbound bodies are not stored by the build. Extra check (revocation) not run. Evidence 1.txt, phr-1..3.</w:t>
             </w:r>
           </w:p>
         </w:tc>
@@ -2274,7 +2178,7 @@
           </w:tcPr>
           <w:p>
             <w:r>
-              <w:t>The results hold for the build and configuration tested from 2026-10-28 to 2026-10-29. The build under test ran on a local machine; ABDM callbacks reached it through a Cloudflare quick tunnel registered as the bridge URL. The tunnel was replaced twice during the run after the machine slept, and the bridge URL re-registered each time (run log). The build does not store the bodies of its outbound replies and pushes (on-discover, on-init, on-confirm, on-notify, on-request, data push, notify); their content is shown by the code and by ABDM accepting them and by what followed. ABDM sandbox: one on-discover was answered with 'Runtime Error', and twice no health-information request followed a granted consent (USER_INIT_LINK_607 passes 1 and 2). Extra checks outside the set (count mismatch ABDM-1037, wrong OTP, consent revocation) were not run.</w:t>
+              <w:t>The results hold for the build and configuration tested from 2026-10-28 to 2026-10-29. The build under test ran on a local machine; ABDM callbacks reached it through a Cloudflare quick tunnel registered as the bridge URL. The tunnel was replaced twice during the run after the machine slept, and the bridge URL re-registered each time (run log). The build does not store the bodies of its outbound replies and pushes (on-discover, on-init, on-confirm, on-notify, on-request, data push, notify); their content is shown by the code and by ABDM accepting them and by what followed. ABDM sandbox: one on-discover was answered with 'Runtime Error', and twice no health-information request followed a granted consent (USER_INIT_LINK_607 passes 1 and 2). Extra checks outside the set (count mismatch ABDM-1037, wrong OTP, consent revocation) were not run. HIP_INIT_SHARE_CARECONTEXT was re-run on 2026-10-29 on backend db30fa2 / frontend feb708f, after a read-only Consents view was added. Backend changes since 85ae1bd are only that view (0326320, db30fa2) and a hospital-role check on the staff ABDM patient routes (a5a4dca); the linking, data-flow, FHIR, gateway and crypto code the other 12 cases ran on is unchanged. Frontend feb708f adds the view to the ABDM Records tab and also carries the M1/M3 commits merged at 00:13 on 2026-10-29 (HIU record request pages and the shared calendar), none of which touches the ABDM Records tab or the linking screens. The quick tunnel was replaced and the bridge URL re-registered for the re-run.</w:t>
             </w:r>
           </w:p>
         </w:tc>
@@ -2690,7 +2594,7 @@
           </w:tcPr>
           <w:p>
             <w:r>
-              <w:t>Clinicx-Backend ABHABang-26-10 at 85ae1bd</w:t>
+              <w:t>Clinicx-Backend ABHABang-26-10 at 85ae1bd; HIP_INIT_SHARE_CARECONTEXT re-run at db30fa2</w:t>
             </w:r>
           </w:p>
         </w:tc>
@@ -2712,7 +2616,7 @@
           </w:tcPr>
           <w:p>
             <w:r>
-              <w:t>Clinicx-Frontend at ab5a8a0</w:t>
+              <w:t>Clinicx-Frontend at ab5a8a0; HIP_INIT_SHARE_CARECONTEXT re-run at feb708f</w:t>
             </w:r>
           </w:p>
         </w:tc>
@@ -6221,7 +6125,7 @@
           </w:tcPr>
           <w:p>
             <w:r>
-              <w:t>CONDITIONAL PASS, 1 pass. Marking: Mandatory. Condition: Expected Result met: records received in the PHR app, decrypted with the HIP's public key and nonce, in NRCES document types (tester's screenshots phr-1..3; records also delivered by transfers 51 and 53 this run). Pushed care contexts are within the consent's and the request date range equals the consent's. Condition: ClinicX has no screen that shows the stored consent (HI types, date range, purpose, expiry); it is stored whole in AbdmConsents only. Outbound bodies are not stored by the build. Extra check (revocation) not run. Evidence 1.txt, phr-1..3.</w:t>
+              <w:t>PASS, 2 passes. Marking: Mandatory.</w:t>
             </w:r>
           </w:p>
         </w:tc>
@@ -6271,7 +6175,7 @@
           </w:tcPr>
           <w:p>
             <w:r>
-              <w:t>Records are shared encrypted on request and shown in the PHR app; there is no screen for stored consents.</w:t>
+              <w:t>Records are shared encrypted on request and shown in the PHR app, and ClinicX shows each stored consent against the patient with its HI types, date range, purpose and expiry.</w:t>
             </w:r>
           </w:p>
         </w:tc>
@@ -6296,75 +6200,68 @@
           </w:tcPr>
           <w:p>
             <w:r>
-              <w:t>8b741177-6594-4137-b999-149176c60196, fa855d87-9ff0-4c50-b124-a076ee45b167</w:t>
+              <w:t>8b0b8f8b-2d65-4296-9c59-6865556cd787, 7a34c022-ec56-46d6-a0dc-2fc139eb86c6</w:t>
             </w:r>
           </w:p>
         </w:tc>
       </w:tr>
     </w:tbl>
+    <w:p>
+      <w:r>
+        <w:drawing>
+          <wp:inline xmlns:a="http://schemas.openxmlformats.org/drawingml/2006/main" xmlns:pic="http://schemas.openxmlformats.org/drawingml/2006/picture">
+            <wp:extent cx="5486400" cy="3025806"/>
+            <wp:docPr id="23" name="Picture 23"/>
+            <wp:cNvGraphicFramePr>
+              <a:graphicFrameLocks noChangeAspect="1"/>
+            </wp:cNvGraphicFramePr>
+            <a:graphic>
+              <a:graphicData uri="http://schemas.openxmlformats.org/drawingml/2006/picture">
+                <pic:pic>
+                  <pic:nvPicPr>
+                    <pic:cNvPr id="0" name="image.png"/>
+                    <pic:cNvPicPr/>
+                  </pic:nvPicPr>
+                  <pic:blipFill>
+                    <a:blip r:embed="rId27"/>
+                    <a:stretch>
+                      <a:fillRect/>
+                    </a:stretch>
+                  </pic:blipFill>
+                  <pic:spPr>
+                    <a:xfrm>
+                      <a:off x="0" y="0"/>
+                      <a:ext cx="5486400" cy="3025806"/>
+                    </a:xfrm>
+                    <a:prstGeom prst="rect"/>
+                  </pic:spPr>
+                </pic:pic>
+              </a:graphicData>
+            </a:graphic>
+          </wp:inline>
+        </w:drawing>
+      </w:r>
+    </w:p>
+    <w:p>
+      <w:pPr>
+        <w:pStyle w:val="Caption"/>
+      </w:pPr>
+      <w:r>
+        <w:t>Figure 23, step 1</w:t>
+      </w:r>
+    </w:p>
     <w:tbl>
       <w:tblPr>
         <w:tblW w:type="auto" w:w="0"/>
         <w:tblLook w:firstColumn="1" w:firstRow="1" w:lastColumn="0" w:lastRow="0" w:noHBand="0" w:noVBand="1" w:val="04A0"/>
       </w:tblPr>
       <w:tblGrid>
-        <w:gridCol w:w="2880"/>
-        <w:gridCol w:w="2880"/>
-        <w:gridCol w:w="2880"/>
+        <w:gridCol w:w="8640"/>
       </w:tblGrid>
       <w:tr>
         <w:tc>
           <w:tcPr>
-            <w:tcW w:type="dxa" w:w="2880"/>
-          </w:tcPr>
-          <w:p>
-            <w:r>
-              <w:drawing>
-                <wp:inline xmlns:a="http://schemas.openxmlformats.org/drawingml/2006/main" xmlns:pic="http://schemas.openxmlformats.org/drawingml/2006/picture">
-                  <wp:extent cx="1627168" cy="3546000"/>
-                  <wp:docPr id="23" name="Picture 23"/>
-                  <wp:cNvGraphicFramePr>
-                    <a:graphicFrameLocks noChangeAspect="1"/>
-                  </wp:cNvGraphicFramePr>
-                  <a:graphic>
-                    <a:graphicData uri="http://schemas.openxmlformats.org/drawingml/2006/picture">
-                      <pic:pic>
-                        <pic:nvPicPr>
-                          <pic:cNvPr id="0" name="image.png"/>
-                          <pic:cNvPicPr/>
-                        </pic:nvPicPr>
-                        <pic:blipFill>
-                          <a:blip r:embed="rId27"/>
-                          <a:stretch>
-                            <a:fillRect/>
-                          </a:stretch>
-                        </pic:blipFill>
-                        <pic:spPr>
-                          <a:xfrm>
-                            <a:off x="0" y="0"/>
-                            <a:ext cx="1627168" cy="3546000"/>
-                          </a:xfrm>
-                          <a:prstGeom prst="rect"/>
-                        </pic:spPr>
-                      </pic:pic>
-                    </a:graphicData>
-                  </a:graphic>
-                </wp:inline>
-              </w:drawing>
-            </w:r>
-          </w:p>
-          <w:p>
-            <w:pPr>
-              <w:pStyle w:val="Caption"/>
-            </w:pPr>
-            <w:r>
-              <w:t>Figure 23, step 1</w:t>
-            </w:r>
-          </w:p>
-        </w:tc>
-        <w:tc>
-          <w:tcPr>
-            <w:tcW w:type="dxa" w:w="2880"/>
+            <w:tcW w:type="dxa" w:w="8640"/>
           </w:tcPr>
           <w:p>
             <w:r>
@@ -6411,55 +6308,6 @@
             </w:r>
           </w:p>
         </w:tc>
-        <w:tc>
-          <w:tcPr>
-            <w:tcW w:type="dxa" w:w="2880"/>
-          </w:tcPr>
-          <w:p>
-            <w:r>
-              <w:drawing>
-                <wp:inline xmlns:a="http://schemas.openxmlformats.org/drawingml/2006/main" xmlns:pic="http://schemas.openxmlformats.org/drawingml/2006/picture">
-                  <wp:extent cx="1627168" cy="3546000"/>
-                  <wp:docPr id="25" name="Picture 25"/>
-                  <wp:cNvGraphicFramePr>
-                    <a:graphicFrameLocks noChangeAspect="1"/>
-                  </wp:cNvGraphicFramePr>
-                  <a:graphic>
-                    <a:graphicData uri="http://schemas.openxmlformats.org/drawingml/2006/picture">
-                      <pic:pic>
-                        <pic:nvPicPr>
-                          <pic:cNvPr id="0" name="image.png"/>
-                          <pic:cNvPicPr/>
-                        </pic:nvPicPr>
-                        <pic:blipFill>
-                          <a:blip r:embed="rId29"/>
-                          <a:stretch>
-                            <a:fillRect/>
-                          </a:stretch>
-                        </pic:blipFill>
-                        <pic:spPr>
-                          <a:xfrm>
-                            <a:off x="0" y="0"/>
-                            <a:ext cx="1627168" cy="3546000"/>
-                          </a:xfrm>
-                          <a:prstGeom prst="rect"/>
-                        </pic:spPr>
-                      </pic:pic>
-                    </a:graphicData>
-                  </a:graphic>
-                </wp:inline>
-              </w:drawing>
-            </w:r>
-          </w:p>
-          <w:p>
-            <w:pPr>
-              <w:pStyle w:val="Caption"/>
-            </w:pPr>
-            <w:r>
-              <w:t>Figure 25, step 3</w:t>
-            </w:r>
-          </w:p>
-        </w:tc>
       </w:tr>
     </w:tbl>
     <w:p>
@@ -6470,142 +6318,11 @@
         <w:t>Failures and iterations log</w:t>
       </w:r>
     </w:p>
-    <w:tbl>
-      <w:tblPr>
-        <w:tblStyle w:val="TableGrid"/>
-        <w:tblW w:type="auto" w:w="0"/>
-        <w:tblLook w:firstColumn="1" w:firstRow="1" w:lastColumn="0" w:lastRow="0" w:noHBand="0" w:noVBand="1" w:val="04A0"/>
-      </w:tblPr>
-      <w:tblGrid>
-        <w:gridCol w:w="1728"/>
-        <w:gridCol w:w="1728"/>
-        <w:gridCol w:w="1728"/>
-        <w:gridCol w:w="1728"/>
-        <w:gridCol w:w="1728"/>
-      </w:tblGrid>
-      <w:tr>
-        <w:trPr>
-          <w:tblHeader w:val="true"/>
-        </w:trPr>
-        <w:tc>
-          <w:tcPr>
-            <w:tcW w:type="dxa" w:w="1728"/>
-          </w:tcPr>
-          <w:p>
-            <w:r>
-              <w:rPr>
-                <w:b/>
-              </w:rPr>
-              <w:t>Test case ID</w:t>
-            </w:r>
-          </w:p>
-        </w:tc>
-        <w:tc>
-          <w:tcPr>
-            <w:tcW w:type="dxa" w:w="1728"/>
-          </w:tcPr>
-          <w:p>
-            <w:r>
-              <w:rPr>
-                <w:b/>
-              </w:rPr>
-              <w:t>Status</w:t>
-            </w:r>
-          </w:p>
-        </w:tc>
-        <w:tc>
-          <w:tcPr>
-            <w:tcW w:type="dxa" w:w="1728"/>
-          </w:tcPr>
-          <w:p>
-            <w:r>
-              <w:rPr>
-                <w:b/>
-              </w:rPr>
-              <w:t>Iterations</w:t>
-            </w:r>
-          </w:p>
-        </w:tc>
-        <w:tc>
-          <w:tcPr>
-            <w:tcW w:type="dxa" w:w="1728"/>
-          </w:tcPr>
-          <w:p>
-            <w:r>
-              <w:rPr>
-                <w:b/>
-              </w:rPr>
-              <w:t>Failure reason</w:t>
-            </w:r>
-          </w:p>
-        </w:tc>
-        <w:tc>
-          <w:tcPr>
-            <w:tcW w:type="dxa" w:w="1728"/>
-          </w:tcPr>
-          <w:p>
-            <w:r>
-              <w:rPr>
-                <w:b/>
-              </w:rPr>
-              <w:t>Error code</w:t>
-            </w:r>
-          </w:p>
-        </w:tc>
-      </w:tr>
-      <w:tr>
-        <w:tc>
-          <w:tcPr>
-            <w:tcW w:type="dxa" w:w="1728"/>
-          </w:tcPr>
-          <w:p>
-            <w:r>
-              <w:t>HIP_INIT_SHARE_CARECONTEXT</w:t>
-            </w:r>
-          </w:p>
-        </w:tc>
-        <w:tc>
-          <w:tcPr>
-            <w:tcW w:type="dxa" w:w="1728"/>
-          </w:tcPr>
-          <w:p>
-            <w:r>
-              <w:t>Conditional pass</w:t>
-            </w:r>
-          </w:p>
-        </w:tc>
-        <w:tc>
-          <w:tcPr>
-            <w:tcW w:type="dxa" w:w="1728"/>
-          </w:tcPr>
-          <w:p>
-            <w:r>
-              <w:t>1</w:t>
-            </w:r>
-          </w:p>
-        </w:tc>
-        <w:tc>
-          <w:tcPr>
-            <w:tcW w:type="dxa" w:w="1728"/>
-          </w:tcPr>
-          <w:p>
-            <w:r>
-              <w:t>Expected Result met: records received in the PHR app, decrypted with the HIP's public key and nonce, in NRCES document types (tester's screenshots phr-1..3; records also delivered by transfers 51 and 53 this run). Pushed care contexts are within the consent's and the request date range equals the consent's. Condition: ClinicX has no screen that shows the stored consent (HI types, date range, purpose, expiry); it is stored whole in AbdmConsents only. Outbound bodies are not stored by the build. Extra check (revocation) not run. Evidence 1.txt, phr-1..3.</w:t>
-            </w:r>
-          </w:p>
-        </w:tc>
-        <w:tc>
-          <w:tcPr>
-            <w:tcW w:type="dxa" w:w="1728"/>
-          </w:tcPr>
-          <w:p>
-            <w:r>
-              <w:t>None found</w:t>
-            </w:r>
-          </w:p>
-        </w:tc>
-      </w:tr>
-    </w:tbl>
+    <w:p>
+      <w:r>
+        <w:t>No case failed, is blocked or passed with a condition.</w:t>
+      </w:r>
+    </w:p>
     <w:p>
       <w:pPr>
         <w:pStyle w:val="Heading1"/>

</xml_diff>

<commit_message>
chore(abdm-ft): name the product Yira Clinics in the M2 report
The report, workbook, results and meta now use the product name, and the
report is version 1.1. A note in the report says the screens still show
the working name ClinicX. The build details keep the repository names.

Co-Authored-By: Claude Opus 5.5 <noreply@anthropic.com>
</commit_message>
<xml_diff>
--- a/abdm-ft/final/report-m2.docx
+++ b/abdm-ft/final/report-m2.docx
@@ -40,7 +40,7 @@
           </w:tcPr>
           <w:p>
             <w:r>
-              <w:t>ClinicX</w:t>
+              <w:t>Yira Clinics</w:t>
             </w:r>
           </w:p>
         </w:tc>
@@ -165,7 +165,7 @@
           </w:tcPr>
           <w:p>
             <w:r>
-              <w:t>1.0</w:t>
+              <w:t>1.1</w:t>
             </w:r>
           </w:p>
         </w:tc>
@@ -190,7 +190,7 @@
           </w:tcPr>
           <w:p>
             <w:r>
-              <w:t>2026-10-29</w:t>
+              <w:t>2026-10-30</w:t>
             </w:r>
           </w:p>
         </w:tc>
@@ -324,7 +324,7 @@
           </w:tcPr>
           <w:p>
             <w:r>
-              <w:t>1.0</w:t>
+              <w:t>1.1</w:t>
             </w:r>
           </w:p>
         </w:tc>
@@ -449,7 +449,7 @@
           </w:tcPr>
           <w:p>
             <w:r>
-              <w:t>2026-10-29</w:t>
+              <w:t>2026-10-30</w:t>
             </w:r>
           </w:p>
         </w:tc>
@@ -570,6 +570,48 @@
           <w:p>
             <w:r>
               <w:t>First issue</w:t>
+            </w:r>
+          </w:p>
+        </w:tc>
+      </w:tr>
+      <w:tr>
+        <w:tc>
+          <w:tcPr>
+            <w:tcW w:type="dxa" w:w="2160"/>
+          </w:tcPr>
+          <w:p>
+            <w:r>
+              <w:t>1.1</w:t>
+            </w:r>
+          </w:p>
+        </w:tc>
+        <w:tc>
+          <w:tcPr>
+            <w:tcW w:type="dxa" w:w="2160"/>
+          </w:tcPr>
+          <w:p>
+            <w:r>
+              <w:t>2026-10-30</w:t>
+            </w:r>
+          </w:p>
+        </w:tc>
+        <w:tc>
+          <w:tcPr>
+            <w:tcW w:type="dxa" w:w="2160"/>
+          </w:tcPr>
+          <w:p>
+            <w:r>
+              <w:t>Manikanta N</w:t>
+            </w:r>
+          </w:p>
+        </w:tc>
+        <w:tc>
+          <w:tcPr>
+            <w:tcW w:type="dxa" w:w="2160"/>
+          </w:tcPr>
+          <w:p>
+            <w:r>
+              <w:t>Product name corrected from ClinicX to Yira Clinics</w:t>
             </w:r>
           </w:p>
         </w:tc>
@@ -1193,7 +1235,7 @@
           </w:tcPr>
           <w:p>
             <w:r>
-              <w:t>ClinicX</w:t>
+              <w:t>Yira Clinics</w:t>
             </w:r>
           </w:p>
         </w:tc>
@@ -2082,7 +2124,7 @@
           </w:tcPr>
           <w:p>
             <w:r>
-              <w:t>ClinicX web (HIP IN3610001937, Ocimum dentistry)</w:t>
+              <w:t>Yira Clinics web (HIP IN3610001937, Ocimum dentistry)</w:t>
             </w:r>
           </w:p>
         </w:tc>
@@ -2178,7 +2220,7 @@
           </w:tcPr>
           <w:p>
             <w:r>
-              <w:t>The results hold for the build and configuration tested from 2026-10-28 to 2026-10-29. The build under test ran on a local machine; ABDM callbacks reached it through a Cloudflare quick tunnel registered as the bridge URL. The tunnel was replaced twice during the run after the machine slept, and the bridge URL re-registered each time (run log). The build does not store the bodies of its outbound replies and pushes (on-discover, on-init, on-confirm, on-notify, on-request, data push, notify); their content is shown by the code and by ABDM accepting them and by what followed. ABDM sandbox: one on-discover was answered with 'Runtime Error', and twice no health-information request followed a granted consent (USER_INIT_LINK_607 passes 1 and 2). Extra checks outside the set (count mismatch ABDM-1037, wrong OTP, consent revocation) were not run. HIP_INIT_SHARE_CARECONTEXT was re-run on 2026-10-29 on backend db30fa2 / frontend feb708f, after a read-only Consents view was added. Backend changes since 85ae1bd are only that view (0326320, db30fa2) and a hospital-role check on the staff ABDM patient routes (a5a4dca); the linking, data-flow, FHIR, gateway and crypto code the other 12 cases ran on is unchanged. Frontend feb708f adds the view to the ABDM Records tab and also carries the M1/M3 commits merged at 00:13 on 2026-10-29 (HIU record request pages and the shared calendar), none of which touches the ABDM Records tab or the linking screens. The quick tunnel was replaced and the bridge URL re-registered for the re-run.</w:t>
+              <w:t>The results hold for the build and configuration tested from 2026-10-28 to 2026-10-29. The build under test ran on a local machine; ABDM callbacks reached it through a Cloudflare quick tunnel registered as the bridge URL. The tunnel was replaced twice during the run after the machine slept, and the bridge URL re-registered each time (run log). The build does not store the bodies of its outbound replies and pushes (on-discover, on-init, on-confirm, on-notify, on-request, data push, notify); their content is shown by the code and by ABDM accepting them and by what followed. ABDM sandbox: one on-discover was answered with 'Runtime Error', and twice no health-information request followed a granted consent (USER_INIT_LINK_607 passes 1 and 2). Extra checks outside the set (count mismatch ABDM-1037, wrong OTP, consent revocation) were not run. HIP_INIT_SHARE_CARECONTEXT was re-run on 2026-10-29 on backend db30fa2 / frontend feb708f, after a read-only Consents view was added. Backend changes since 85ae1bd are only that view (0326320, db30fa2) and a hospital-role check on the staff ABDM patient routes (a5a4dca); the linking, data-flow, FHIR, gateway and crypto code the other 12 cases ran on is unchanged. Frontend feb708f adds the view to the ABDM Records tab and also carries the M1/M3 commits merged at 00:13 on 2026-10-29 (HIU record request pages and the shared calendar), none of which touches the ABDM Records tab or the linking screens. The quick tunnel was replaced and the bridge URL re-registered for the re-run. The product's name is Yira Clinics. Its screens still show the working name ClinicX in places, so screenshots and screen messages quoted in this report can carry that name.</w:t>
             </w:r>
           </w:p>
         </w:tc>
@@ -6175,7 +6217,7 @@
           </w:tcPr>
           <w:p>
             <w:r>
-              <w:t>Records are shared encrypted on request and shown in the PHR app, and ClinicX shows each stored consent against the patient with its HI types, date range, purpose and expiry.</w:t>
+              <w:t>Records are shared encrypted on request and shown in the PHR app, and Yira Clinics shows each stored consent against the patient with its HI types, date range, purpose and expiry.</w:t>
             </w:r>
           </w:p>
         </w:tc>

</xml_diff>

<commit_message>
chore(abdm-ft): mask patient details in the M2 test artifacts
- Dates and years of birth masked in the tracked M2 text files and both
  M2 workbooks, archive included.
- Names, initials and dates of birth masked in the 17 current screenshots
  that showed them, and the report rebuilt from them as version 1.2.

The 30 archived screenshots, and the two archived reports that embed
them, are not masked yet. Earlier commits still hold the unmasked files.

Co-Authored-By: Claude Opus 5.5 <noreply@anthropic.com>
</commit_message>
<xml_diff>
--- a/abdm-ft/final/report-m2.docx
+++ b/abdm-ft/final/report-m2.docx
@@ -165,7 +165,7 @@
           </w:tcPr>
           <w:p>
             <w:r>
-              <w:t>1.1</w:t>
+              <w:t>1.2</w:t>
             </w:r>
           </w:p>
         </w:tc>
@@ -324,7 +324,7 @@
           </w:tcPr>
           <w:p>
             <w:r>
-              <w:t>1.1</w:t>
+              <w:t>1.2</w:t>
             </w:r>
           </w:p>
         </w:tc>
@@ -612,6 +612,48 @@
           <w:p>
             <w:r>
               <w:t>Product name corrected from ClinicX to Yira Clinics</w:t>
+            </w:r>
+          </w:p>
+        </w:tc>
+      </w:tr>
+      <w:tr>
+        <w:tc>
+          <w:tcPr>
+            <w:tcW w:type="dxa" w:w="2160"/>
+          </w:tcPr>
+          <w:p>
+            <w:r>
+              <w:t>1.2</w:t>
+            </w:r>
+          </w:p>
+        </w:tc>
+        <w:tc>
+          <w:tcPr>
+            <w:tcW w:type="dxa" w:w="2160"/>
+          </w:tcPr>
+          <w:p>
+            <w:r>
+              <w:t>2026-10-30</w:t>
+            </w:r>
+          </w:p>
+        </w:tc>
+        <w:tc>
+          <w:tcPr>
+            <w:tcW w:type="dxa" w:w="2160"/>
+          </w:tcPr>
+          <w:p>
+            <w:r>
+              <w:t>Manikanta N</w:t>
+            </w:r>
+          </w:p>
+        </w:tc>
+        <w:tc>
+          <w:tcPr>
+            <w:tcW w:type="dxa" w:w="2160"/>
+          </w:tcPr>
+          <w:p>
+            <w:r>
+              <w:t>Patient names, initials and dates of birth masked in the screenshots; year of birth masked in the workbook</w:t>
             </w:r>
           </w:p>
         </w:tc>

</xml_diff>